<commit_message>
docs: corrigir gramática da documentação
</commit_message>
<xml_diff>
--- a/docs/requisitos-mvp-mercado-one.docx
+++ b/docs/requisitos-mvp-mercado-one.docx
@@ -24,7 +24,7 @@
         <w:spacing w:after="100"/>
       </w:pPr>
       <w:r>
-        <w:t>O Mercado One sera um ERP para pequenos mercados varejistas, com CRM e PDV integrados. O MVP deve provar a operacao essencial de uma loja fisica: cadastrar produtos, controlar estoque simples, registrar entradas, vender no PDV, operar parcialmente offline, manter clientes e consultar relatorios basicos.</w:t>
+        <w:t>O Mercado One será um ERP para pequenos mercados varejistas, com CRM e PDV integrados. O MVP deve provar a operação essencial de uma loja física: cadastrar produtos, controlar estoque simples, registrar entradas, vender no PDV, operar parcialmente offline, manter clientes e consultar relatórios básicos.</w:t>
       </w:r>
     </w:p>
     <w:p>
@@ -32,7 +32,7 @@
         <w:spacing w:after="100"/>
       </w:pPr>
       <w:r>
-        <w:t>O documento define requisitos em nivel suficiente para orientar backlog, modelagem de dados e implementacao futura usando a stack restrita do projeto: Java, Angular, TypeScript, HTML, CSS e SQL.</w:t>
+        <w:t>O documento define requisitos em nível suficiente para orientar backlog, modelagem de dados e implementação futura usando a stack restrita do projeto: Java, Angular, TypeScript, HTML, CSS e SQL.</w:t>
       </w:r>
     </w:p>
     <w:p>
@@ -40,7 +40,7 @@
         <w:spacing w:after="100"/>
       </w:pPr>
       <w:r>
-        <w:t>Nota de manutencao: este documento e conceitual e registra requisitos/criterios de aceite do MVP. Para saber o que ja esta implementado no codigo, consulte `docs/estado-atual.md`, `docs/backlog-mvp.md` e os READMEs dos subprojetos.</w:t>
+        <w:t>Nota de manutenção: este documento é conceitual e registra requisitos/critérios de aceite do MVP. Para saber o que já está implementado no código, consulte `docs/estado-atual.md`, `docs/backlog-mvp.md` e os READMEs dos subprojetos.</w:t>
       </w:r>
     </w:p>
     <w:p>
@@ -57,7 +57,7 @@
         <w:spacing w:after="30"/>
       </w:pPr>
       <w:r>
-        <w:t>Permitir que um pequeno mercado opere cadastros, estoque e vendas presenciais em um sistema unico.</w:t>
+        <w:t>Permitir que um pequeno mercado opere cadastros, estoque e vendas presenciais em um sistema único.</w:t>
       </w:r>
     </w:p>
     <w:p>
@@ -66,7 +66,7 @@
         <w:spacing w:after="30"/>
       </w:pPr>
       <w:r>
-        <w:t>Reduzir dependencia de controles manuais para produtos, saldos e vendas.</w:t>
+        <w:t>Reduzir dependência de controles manuais para produtos, saldos e vendas.</w:t>
       </w:r>
     </w:p>
     <w:p>
@@ -75,7 +75,7 @@
         <w:spacing w:after="30"/>
       </w:pPr>
       <w:r>
-        <w:t>Permitir venda no PDV mesmo durante indisponibilidade temporaria de internet ou servidor.</w:t>
+        <w:t>Permitir venda no PDV mesmo durante indisponibilidade temporária de internet ou servidor.</w:t>
       </w:r>
     </w:p>
     <w:p>
@@ -84,7 +84,7 @@
         <w:spacing w:after="30"/>
       </w:pPr>
       <w:r>
-        <w:t>Registrar clientes e historico de compras para uma base inicial de CRM.</w:t>
+        <w:t>Registrar clientes e histórico de compras para uma base inicial de CRM.</w:t>
       </w:r>
     </w:p>
     <w:p>
@@ -93,7 +93,7 @@
         <w:spacing w:after="30"/>
       </w:pPr>
       <w:r>
-        <w:t>Fornecer relatorios operacionais minimos para acompanhamento diario.</w:t>
+        <w:t>Fornecer relatórios operacionais mínimos para acompanhamento diário.</w:t>
       </w:r>
     </w:p>
     <w:p>
@@ -102,7 +102,7 @@
         <w:spacing w:after="30"/>
       </w:pPr>
       <w:r>
-        <w:t>Preparar a base de dados para informacoes fiscais, sem emitir documentos fiscais no MVP.</w:t>
+        <w:t>Preparar a base de dados para informações fiscais, sem emitir documentos fiscais no MVP.</w:t>
       </w:r>
     </w:p>
     <w:p>
@@ -110,7 +110,7 @@
         <w:pStyle w:val="Heading1"/>
       </w:pPr>
       <w:r>
-        <w:t>3. Publico-Alvo</w:t>
+        <w:t>3. Público-Alvo</w:t>
       </w:r>
     </w:p>
     <w:p>
@@ -118,7 +118,7 @@
         <w:spacing w:after="100"/>
       </w:pPr>
       <w:r>
-        <w:t>O MVP e destinado a pequenos mercados varejistas com uma unica loja por implantacao inicial. O perfil esperado e uma operacao com poucos usuarios administrativos, um ou mais operadores de caixa e controle de estoque simples por produto e quantidade.</w:t>
+        <w:t>O MVP é destinado a pequenos mercados varejistas com uma única loja por implantação inicial. O perfil esperado é uma operação com poucos usuários administrativos, um ou mais operadores de caixa e controle de estoque simples por produto e quantidade.</w:t>
       </w:r>
     </w:p>
     <w:p>
@@ -142,7 +142,7 @@
         <w:spacing w:after="100"/>
       </w:pPr>
       <w:r>
-        <w:t>Responsavel pela configuracao geral do mercado, usuarios, permissoes, consulta de relatorios e supervisao da operacao.</w:t>
+        <w:t>Responsável pela configuração geral do mercado, usuários, permissões, consulta de relatórios e supervisão da operação.</w:t>
       </w:r>
     </w:p>
     <w:p>
@@ -158,7 +158,7 @@
         <w:spacing w:after="100"/>
       </w:pPr>
       <w:r>
-        <w:t>Responsavel por cadastros, entradas de estoque, ajustes operacionais, acompanhamento de vendas e relatorios.</w:t>
+        <w:t>Responsável por cadastros, entradas de estoque, ajustes operacionais, acompanhamento de vendas e relatórios.</w:t>
       </w:r>
     </w:p>
     <w:p>
@@ -174,7 +174,7 @@
         <w:spacing w:after="100"/>
       </w:pPr>
       <w:r>
-        <w:t>Responsavel por realizar vendas no PDV, consultar produtos, identificar clientes, registrar pagamentos manuais e finalizar vendas.</w:t>
+        <w:t>Responsável por realizar vendas no PDV, consultar produtos, identificar clientes, registrar pagamentos manuais e finalizar vendas.</w:t>
       </w:r>
     </w:p>
     <w:p>
@@ -190,7 +190,7 @@
         <w:spacing w:after="100"/>
       </w:pPr>
       <w:r>
-        <w:t>Responsavel por consultar produtos, registrar ou apoiar entradas de mercadorias e realizar ajustes de estoque quando autorizado.</w:t>
+        <w:t>Responsável por consultar produtos, registrar ou apoiar entradas de mercadorias e realizar ajustes de estoque quando autorizado.</w:t>
       </w:r>
     </w:p>
     <w:p>
@@ -206,7 +206,7 @@
         <w:pStyle w:val="Heading2"/>
       </w:pPr>
       <w:r>
-        <w:t>5.1 Gestao de Usuarios e Permissoes</w:t>
+        <w:t>5.1 Gestão de Usuários e Permissões</w:t>
       </w:r>
     </w:p>
     <w:p>
@@ -214,7 +214,7 @@
         <w:spacing w:after="100"/>
       </w:pPr>
       <w:r>
-        <w:t>O sistema deve permitir cadastro, edicao, ativacao e desativacao de usuarios. Cada usuario deve possuir um perfil de acesso simples, no minimo: administrador, gerente, operador de caixa e estoquista.</w:t>
+        <w:t>O sistema deve permitir cadastro, edição, ativação e desativação de usuários. Cada usuário deve possuir um perfil de acesso simples, no mínimo: administrador, gerente, operador de caixa e estoquista.</w:t>
       </w:r>
     </w:p>
     <w:p>
@@ -231,7 +231,7 @@
         <w:spacing w:after="30"/>
       </w:pPr>
       <w:r>
-        <w:t>Autenticar usuarios antes do acesso ao sistema.</w:t>
+        <w:t>Autenticar usuários antes do acesso ao sistema.</w:t>
       </w:r>
     </w:p>
     <w:p>
@@ -249,7 +249,7 @@
         <w:spacing w:after="30"/>
       </w:pPr>
       <w:r>
-        <w:t>Permitir redefinicao administrativa de senha.</w:t>
+        <w:t>Permitir redefinição administrativa de senha.</w:t>
       </w:r>
     </w:p>
     <w:p>
@@ -258,7 +258,7 @@
         <w:spacing w:after="30"/>
       </w:pPr>
       <w:r>
-        <w:t>Bloquear acesso de usuarios inativos.</w:t>
+        <w:t>Bloquear acesso de usuários inativos.</w:t>
       </w:r>
     </w:p>
     <w:p>
@@ -267,7 +267,7 @@
         <w:spacing w:after="30"/>
       </w:pPr>
       <w:r>
-        <w:t>Registrar usuario responsavel em operacoes criticas.</w:t>
+        <w:t>Registrar usuário responsável em operações críticas.</w:t>
       </w:r>
     </w:p>
     <w:p>
@@ -300,7 +300,7 @@
         <w:spacing w:after="30"/>
       </w:pPr>
       <w:r>
-        <w:t>Cadastrar produto com nome, codigo de barras ou SKU, categoria, unidade, preco de venda, status e dados fiscais preparatorios.</w:t>
+        <w:t>Cadastrar produto com nome, código de barras ou SKU, categoria, unidade, preço de venda, status e dados fiscais preparatórios.</w:t>
       </w:r>
     </w:p>
     <w:p>
@@ -327,7 +327,7 @@
         <w:spacing w:after="30"/>
       </w:pPr>
       <w:r>
-        <w:t>Pesquisar produto por nome, codigo de barras ou SKU.</w:t>
+        <w:t>Pesquisar produto por nome, código de barras ou SKU.</w:t>
       </w:r>
     </w:p>
     <w:p>
@@ -344,7 +344,7 @@
         <w:spacing w:after="100"/>
       </w:pPr>
       <w:r>
-        <w:t>Campos fiscais preparatorios sugeridos:</w:t>
+        <w:t>Campos fiscais preparatórios sugeridos:</w:t>
       </w:r>
     </w:p>
     <w:p>
@@ -362,7 +362,7 @@
         <w:spacing w:after="30"/>
       </w:pPr>
       <w:r>
-        <w:t>CEST, quando aplicavel.</w:t>
+        <w:t>CEST, quando aplicável.</w:t>
       </w:r>
     </w:p>
     <w:p>
@@ -371,7 +371,7 @@
         <w:spacing w:after="30"/>
       </w:pPr>
       <w:r>
-        <w:t>CFOP padrao sugerido.</w:t>
+        <w:t>CFOP padrão sugerido.</w:t>
       </w:r>
     </w:p>
     <w:p>
@@ -389,7 +389,7 @@
         <w:spacing w:after="30"/>
       </w:pPr>
       <w:r>
-        <w:t>Aliquota ou classificacao tributaria interna, quando definida pelo mercado.</w:t>
+        <w:t>Alíquota ou classificação tributária interna, quando definida pelo mercado.</w:t>
       </w:r>
     </w:p>
     <w:p>
@@ -473,7 +473,7 @@
         <w:spacing w:after="30"/>
       </w:pPr>
       <w:r>
-        <w:t>Cadastrar fornecedor com nome, documento, telefone, email e observacoes.</w:t>
+        <w:t>Cadastrar fornecedor com nome, documento, telefone, email e observações.</w:t>
       </w:r>
     </w:p>
     <w:p>
@@ -499,7 +499,7 @@
         <w:pStyle w:val="Heading2"/>
       </w:pPr>
       <w:r>
-        <w:t>5.5 Cadastro de Clientes e CRM Basico</w:t>
+        <w:t>5.5 Cadastro de Clientes e CRM Básico</w:t>
       </w:r>
     </w:p>
     <w:p>
@@ -507,7 +507,7 @@
         <w:spacing w:after="100"/>
       </w:pPr>
       <w:r>
-        <w:t>O sistema deve permitir cadastrar clientes para consulta no PDV e formacao de historico de compras.</w:t>
+        <w:t>O sistema deve permitir cadastrar clientes para consulta no PDV e formação de histórico de compras.</w:t>
       </w:r>
     </w:p>
     <w:p>
@@ -524,7 +524,7 @@
         <w:spacing w:after="30"/>
       </w:pPr>
       <w:r>
-        <w:t>Cadastrar cliente com nome, telefone, email, documento opcional e consentimento basico de contato.</w:t>
+        <w:t>Cadastrar cliente com nome, telefone, email, documento opcional e consentimento básico de contato.</w:t>
       </w:r>
     </w:p>
     <w:p>
@@ -551,7 +551,7 @@
         <w:spacing w:after="30"/>
       </w:pPr>
       <w:r>
-        <w:t>Consultar historico de compras do cliente.</w:t>
+        <w:t>Consultar histórico de compras do cliente.</w:t>
       </w:r>
     </w:p>
     <w:p>
@@ -560,7 +560,7 @@
         <w:spacing w:after="30"/>
       </w:pPr>
       <w:r>
-        <w:t>Permitir edicao e inativacao de cliente.</w:t>
+        <w:t>Permitir edição e inativação de cliente.</w:t>
       </w:r>
     </w:p>
     <w:p>
@@ -568,7 +568,7 @@
         <w:spacing w:after="100"/>
       </w:pPr>
       <w:r>
-        <w:t>Ficam fora do MVP campanhas, segmentacoes automaticas, programas de pontos, cashback e disparos integrados de mensagens.</w:t>
+        <w:t>Ficam fora do MVP campanhas, segmentações automáticas, programas de pontos, cashback e disparos integrados de mensagens.</w:t>
       </w:r>
     </w:p>
     <w:p>
@@ -637,7 +637,7 @@
         <w:spacing w:after="30"/>
       </w:pPr>
       <w:r>
-        <w:t>Exibir movimentacoes de estoque por periodo e produto.</w:t>
+        <w:t>Exibir movimentações de estoque por período e produto.</w:t>
       </w:r>
     </w:p>
     <w:p>
@@ -646,7 +646,7 @@
         <w:spacing w:after="30"/>
       </w:pPr>
       <w:r>
-        <w:t>Impedir saldo negativo quando a venda estiver online, salvo se uma configuracao futura permitir o contrario.</w:t>
+        <w:t>Impedir saldo negativo quando a venda estiver online, salvo se uma configuração futura permitir o contrario.</w:t>
       </w:r>
     </w:p>
     <w:p>
@@ -654,7 +654,7 @@
         <w:spacing w:after="100"/>
       </w:pPr>
       <w:r>
-        <w:t>Nao fazem parte do MVP controle por lote, validade, multi-deposito, enderecamento, inventario ciclico formal ou custo medio avancado.</w:t>
+        <w:t>Não fazem parte do MVP controle por lote, validade, multi-depósito, endereçamento, inventário cíclico formal ou custo médio avançado.</w:t>
       </w:r>
     </w:p>
     <w:p>
@@ -670,7 +670,7 @@
         <w:spacing w:after="100"/>
       </w:pPr>
       <w:r>
-        <w:t>O sistema deve permitir registrar entrada de mercadorias sem implementar um modulo completo de compras.</w:t>
+        <w:t>O sistema deve permitir registrar entrada de mercadorias sem implementar um módulo completo de compras.</w:t>
       </w:r>
     </w:p>
     <w:p>
@@ -687,7 +687,7 @@
         <w:spacing w:after="30"/>
       </w:pPr>
       <w:r>
-        <w:t>Registrar entrada com data, fornecedor opcional, itens, quantidades e observacao.</w:t>
+        <w:t>Registrar entrada com data, fornecedor opcional, itens, quantidades e observação.</w:t>
       </w:r>
     </w:p>
     <w:p>
@@ -696,7 +696,7 @@
         <w:spacing w:after="30"/>
       </w:pPr>
       <w:r>
-        <w:t>Atualizar saldo de estoque apos confirmacao da entrada.</w:t>
+        <w:t>Atualizar saldo de estoque após confirmação da entrada.</w:t>
       </w:r>
     </w:p>
     <w:p>
@@ -705,7 +705,7 @@
         <w:spacing w:after="30"/>
       </w:pPr>
       <w:r>
-        <w:t>Registrar movimentacao de estoque para cada item recebido.</w:t>
+        <w:t>Registrar movimentação de estoque para cada item recebido.</w:t>
       </w:r>
     </w:p>
     <w:p>
@@ -714,7 +714,7 @@
         <w:spacing w:after="30"/>
       </w:pPr>
       <w:r>
-        <w:t>Permitir consulta de entradas por periodo.</w:t>
+        <w:t>Permitir consulta de entradas por período.</w:t>
       </w:r>
     </w:p>
     <w:p>
@@ -730,7 +730,7 @@
         <w:spacing w:after="100"/>
       </w:pPr>
       <w:r>
-        <w:t>O PDV deve permitir a venda presencial de forma simples e rapida.</w:t>
+        <w:t>O PDV deve permitir a venda presencial de forma simples e rápida.</w:t>
       </w:r>
     </w:p>
     <w:p>
@@ -756,7 +756,7 @@
         <w:spacing w:after="30"/>
       </w:pPr>
       <w:r>
-        <w:t>Adicionar produto por codigo de barras, SKU ou busca por nome.</w:t>
+        <w:t>Adicionar produto por código de barras, SKU ou busca por nome.</w:t>
       </w:r>
     </w:p>
     <w:p>
@@ -765,7 +765,7 @@
         <w:spacing w:after="30"/>
       </w:pPr>
       <w:r>
-        <w:t>Alterar quantidade antes da finalizacao.</w:t>
+        <w:t>Alterar quantidade antes da finalização.</w:t>
       </w:r>
     </w:p>
     <w:p>
@@ -774,7 +774,7 @@
         <w:spacing w:after="30"/>
       </w:pPr>
       <w:r>
-        <w:t>Remover item antes da finalizacao.</w:t>
+        <w:t>Remover item antes da finalização.</w:t>
       </w:r>
     </w:p>
     <w:p>
@@ -792,7 +792,7 @@
         <w:spacing w:after="30"/>
       </w:pPr>
       <w:r>
-        <w:t>Cancelar venda antes da finalizacao.</w:t>
+        <w:t>Cancelar venda antes da finalização.</w:t>
       </w:r>
     </w:p>
     <w:p>
@@ -828,7 +828,7 @@
         <w:spacing w:after="30"/>
       </w:pPr>
       <w:r>
-        <w:t>Baixar estoque apos finalizacao online confirmada.</w:t>
+        <w:t>Baixar estoque após finalização online confirmada.</w:t>
       </w:r>
     </w:p>
     <w:p>
@@ -863,7 +863,7 @@
         <w:spacing w:after="30"/>
       </w:pPr>
       <w:r>
-        <w:t>Cartao.</w:t>
+        <w:t>Cartão.</w:t>
       </w:r>
     </w:p>
     <w:p>
@@ -889,7 +889,7 @@
         <w:spacing w:after="100"/>
       </w:pPr>
       <w:r>
-        <w:t>O MVP nao inclui TEF, integracao com adquirente, geracao de cobranca PIX, conciliacao automatica ou comprovante fiscal.</w:t>
+        <w:t>O MVP não inclui TEF, integração com adquirente, geração de cobrança PIX, conciliação automática ou comprovante fiscal.</w:t>
       </w:r>
     </w:p>
     <w:p>
@@ -905,7 +905,7 @@
         <w:spacing w:after="100"/>
       </w:pPr>
       <w:r>
-        <w:t>O PDV deve permitir registrar vendas quando houver indisponibilidade temporaria de comunicacao com o servidor.</w:t>
+        <w:t>O PDV deve permitir registrar vendas quando houver indisponibilidade temporária de comunicação com o servidor.</w:t>
       </w:r>
     </w:p>
     <w:p>
@@ -922,7 +922,7 @@
         <w:spacing w:after="30"/>
       </w:pPr>
       <w:r>
-        <w:t>Manter catalogo local previamente carregado com produtos ativos e precos vigentes.</w:t>
+        <w:t>Manter catálogo local previamente carregado com produtos ativos e preços vigentes.</w:t>
       </w:r>
     </w:p>
     <w:p>
@@ -931,7 +931,7 @@
         <w:spacing w:after="30"/>
       </w:pPr>
       <w:r>
-        <w:t>Permitir venda offline usando os dados locais disponiveis.</w:t>
+        <w:t>Permitir venda offline usando os dados locais disponíveis.</w:t>
       </w:r>
     </w:p>
     <w:p>
@@ -940,7 +940,7 @@
         <w:spacing w:after="30"/>
       </w:pPr>
       <w:r>
-        <w:t>Atribuir identificador local temporario para venda offline.</w:t>
+        <w:t>Atribuir identificador local temporário para venda offline.</w:t>
       </w:r>
     </w:p>
     <w:p>
@@ -958,7 +958,7 @@
         <w:spacing w:after="30"/>
       </w:pPr>
       <w:r>
-        <w:t>Exibir status de sincronizacao da venda.</w:t>
+        <w:t>Exibir status de sincronização da venda.</w:t>
       </w:r>
     </w:p>
     <w:p>
@@ -967,7 +967,7 @@
         <w:spacing w:after="30"/>
       </w:pPr>
       <w:r>
-        <w:t>Sincronizar vendas pendentes quando a comunicacao retornar.</w:t>
+        <w:t>Sincronizar vendas pendentes quando a comunicação retornar.</w:t>
       </w:r>
     </w:p>
     <w:p>
@@ -976,7 +976,7 @@
         <w:spacing w:after="30"/>
       </w:pPr>
       <w:r>
-        <w:t>Registrar conflitos de preco, produto ou estoque para revisao.</w:t>
+        <w:t>Registrar conflitos de preço, produto ou estoque para revisão.</w:t>
       </w:r>
     </w:p>
     <w:p>
@@ -985,7 +985,7 @@
         <w:spacing w:after="30"/>
       </w:pPr>
       <w:r>
-        <w:t>Nao apagar venda offline original em caso de conflito.</w:t>
+        <w:t>Não apagar venda offline original em caso de conflito.</w:t>
       </w:r>
     </w:p>
     <w:p>
@@ -1002,7 +1002,7 @@
         <w:spacing w:after="30"/>
       </w:pPr>
       <w:r>
-        <w:t>Pendente de sincronizacao.</w:t>
+        <w:t>Pendente de sincronização.</w:t>
       </w:r>
     </w:p>
     <w:p>
@@ -1029,7 +1029,7 @@
         <w:spacing w:after="30"/>
       </w:pPr>
       <w:r>
-        <w:t>Falha de sincronizacao.</w:t>
+        <w:t>Falha de sincronização.</w:t>
       </w:r>
     </w:p>
     <w:p>
@@ -1037,7 +1037,7 @@
         <w:spacing w:after="100"/>
       </w:pPr>
       <w:r>
-        <w:t>O MVP nao precisa permitir cadastro de produtos, cadastro completo de clientes, cancelamento pos-venda ou ajuste de estoque em modo offline.</w:t>
+        <w:t>O MVP não precisa permitir cadastro de produtos, cadastro completo de clientes, cancelamento pós-venda ou ajuste de estoque em modo offline.</w:t>
       </w:r>
     </w:p>
     <w:p>
@@ -1045,7 +1045,7 @@
         <w:pStyle w:val="Heading2"/>
       </w:pPr>
       <w:r>
-        <w:t>5.10 Relatorios Operacionais</w:t>
+        <w:t>5.10 Relatórios Operacionais</w:t>
       </w:r>
     </w:p>
     <w:p>
@@ -1053,7 +1053,7 @@
         <w:spacing w:after="100"/>
       </w:pPr>
       <w:r>
-        <w:t>O sistema deve fornecer relatorios minimos para acompanhamento da operacao.</w:t>
+        <w:t>O sistema deve fornecer relatórios mínimos para acompanhamento da operação.</w:t>
       </w:r>
     </w:p>
     <w:p>
@@ -1070,7 +1070,7 @@
         <w:spacing w:after="30"/>
       </w:pPr>
       <w:r>
-        <w:t>Vendas por periodo.</w:t>
+        <w:t>Vendas por período.</w:t>
       </w:r>
     </w:p>
     <w:p>
@@ -1097,7 +1097,7 @@
         <w:spacing w:after="30"/>
       </w:pPr>
       <w:r>
-        <w:t>Movimentacoes de estoque por periodo.</w:t>
+        <w:t>Movimentações de estoque por período.</w:t>
       </w:r>
     </w:p>
     <w:p>
@@ -1123,7 +1123,7 @@
         <w:spacing w:after="100"/>
       </w:pPr>
       <w:r>
-        <w:t>Os relatorios devem permitir filtros basicos por periodo e, quando aplicavel, produto, categoria, operador ou cliente.</w:t>
+        <w:t>Os relatórios devem permitir filtros básicos por período e, quando aplicável, produto, categoria, operador ou cliente.</w:t>
       </w:r>
     </w:p>
     <w:p>
@@ -1139,7 +1139,7 @@
         <w:pStyle w:val="Heading2"/>
       </w:pPr>
       <w:r>
-        <w:t>UC01 - Gerenciar Usuarios</w:t>
+        <w:t>UC01 - Gerenciar Usuários</w:t>
       </w:r>
     </w:p>
     <w:p>
@@ -1164,7 +1164,7 @@
         <w:spacing w:after="30"/>
       </w:pPr>
       <w:r>
-        <w:t>Administrador acessa a area de usuarios.</w:t>
+        <w:t>Administrador acessa a área de usuários.</w:t>
       </w:r>
     </w:p>
     <w:p>
@@ -1173,7 +1173,7 @@
         <w:spacing w:after="30"/>
       </w:pPr>
       <w:r>
-        <w:t>Sistema lista usuarios existentes.</w:t>
+        <w:t>Sistema lista usuários existentes.</w:t>
       </w:r>
     </w:p>
     <w:p>
@@ -1182,7 +1182,7 @@
         <w:spacing w:after="30"/>
       </w:pPr>
       <w:r>
-        <w:t>Administrador cria ou edita um usuario.</w:t>
+        <w:t>Administrador cria ou edita um usuário.</w:t>
       </w:r>
     </w:p>
     <w:p>
@@ -1200,7 +1200,7 @@
         <w:spacing w:after="30"/>
       </w:pPr>
       <w:r>
-        <w:t>Sistema salva o usuario e aplica permissoes.</w:t>
+        <w:t>Sistema salva o usuário e aplica permissões.</w:t>
       </w:r>
     </w:p>
     <w:p>
@@ -1208,7 +1208,7 @@
         <w:spacing w:after="100"/>
       </w:pPr>
       <w:r>
-        <w:t>Criterios de aceite:</w:t>
+        <w:t>Critérios de aceite:</w:t>
       </w:r>
     </w:p>
     <w:p>
@@ -1217,7 +1217,7 @@
         <w:spacing w:after="30"/>
       </w:pPr>
       <w:r>
-        <w:t>Usuario inativo nao consegue autenticar.</w:t>
+        <w:t>Usuário inativo não consegue autenticar.</w:t>
       </w:r>
     </w:p>
     <w:p>
@@ -1226,7 +1226,7 @@
         <w:spacing w:after="30"/>
       </w:pPr>
       <w:r>
-        <w:t>Operador de caixa nao acessa funcionalidades administrativas.</w:t>
+        <w:t>Operador de caixa não acessa funcionalidades administrativas.</w:t>
       </w:r>
     </w:p>
     <w:p>
@@ -1235,7 +1235,7 @@
         <w:spacing w:after="30"/>
       </w:pPr>
       <w:r>
-        <w:t>Operacoes criticas registram usuario responsavel.</w:t>
+        <w:t>Operações críticas registram usuário responsável.</w:t>
       </w:r>
     </w:p>
     <w:p>
@@ -1277,7 +1277,7 @@
         <w:spacing w:after="30"/>
       </w:pPr>
       <w:r>
-        <w:t>Informa nome, codigo, categoria, unidade, preco, status e dados fiscais preparatorios.</w:t>
+        <w:t>Informa nome, código, categoria, unidade, preço, status e dados fiscais preparatórios.</w:t>
       </w:r>
     </w:p>
     <w:p>
@@ -1286,7 +1286,7 @@
         <w:spacing w:after="30"/>
       </w:pPr>
       <w:r>
-        <w:t>Sistema valida campos obrigatorios.</w:t>
+        <w:t>Sistema valida campos obrigatórios.</w:t>
       </w:r>
     </w:p>
     <w:p>
@@ -1304,7 +1304,7 @@
         <w:spacing w:after="30"/>
       </w:pPr>
       <w:r>
-        <w:t>Produto ativo fica disponivel para venda e consulta.</w:t>
+        <w:t>Produto ativo fica disponível para venda e consulta.</w:t>
       </w:r>
     </w:p>
     <w:p>
@@ -1312,7 +1312,7 @@
         <w:spacing w:after="100"/>
       </w:pPr>
       <w:r>
-        <w:t>Criterios de aceite:</w:t>
+        <w:t>Critérios de aceite:</w:t>
       </w:r>
     </w:p>
     <w:p>
@@ -1330,7 +1330,7 @@
         <w:spacing w:after="30"/>
       </w:pPr>
       <w:r>
-        <w:t>Produto inativo nao aparece para nova venda.</w:t>
+        <w:t>Produto inativo não aparece para nova venda.</w:t>
       </w:r>
     </w:p>
     <w:p>
@@ -1339,7 +1339,7 @@
         <w:spacing w:after="30"/>
       </w:pPr>
       <w:r>
-        <w:t>Produto pode ser encontrado por nome, SKU ou codigo de barras.</w:t>
+        <w:t>Produto pode ser encontrado por nome, SKU ou código de barras.</w:t>
       </w:r>
     </w:p>
     <w:p>
@@ -1372,7 +1372,7 @@
         <w:spacing w:after="30"/>
       </w:pPr>
       <w:r>
-        <w:t>Usuario inicia uma entrada de estoque.</w:t>
+        <w:t>Usuário inicia uma entrada de estoque.</w:t>
       </w:r>
     </w:p>
     <w:p>
@@ -1408,7 +1408,7 @@
         <w:spacing w:after="30"/>
       </w:pPr>
       <w:r>
-        <w:t>Sistema atualiza saldos e registra movimentacoes.</w:t>
+        <w:t>Sistema atualiza saldos e registra movimentações.</w:t>
       </w:r>
     </w:p>
     <w:p>
@@ -1416,7 +1416,7 @@
         <w:spacing w:after="100"/>
       </w:pPr>
       <w:r>
-        <w:t>Criterios de aceite:</w:t>
+        <w:t>Critérios de aceite:</w:t>
       </w:r>
     </w:p>
     <w:p>
@@ -1434,7 +1434,7 @@
         <w:spacing w:after="30"/>
       </w:pPr>
       <w:r>
-        <w:t>Cada item gera movimentacao de estoque.</w:t>
+        <w:t>Cada item gera movimentação de estoque.</w:t>
       </w:r>
     </w:p>
     <w:p>
@@ -1443,7 +1443,7 @@
         <w:spacing w:after="30"/>
       </w:pPr>
       <w:r>
-        <w:t>Entrada fica disponivel para consulta por periodo.</w:t>
+        <w:t>Entrada fica disponível para consulta por período.</w:t>
       </w:r>
     </w:p>
     <w:p>
@@ -1503,7 +1503,7 @@
         <w:spacing w:after="30"/>
       </w:pPr>
       <w:r>
-        <w:t>Operador identifica cliente, se aplicavel.</w:t>
+        <w:t>Operador identifica cliente, se aplicável.</w:t>
       </w:r>
     </w:p>
     <w:p>
@@ -1538,7 +1538,7 @@
         <w:spacing w:after="100"/>
       </w:pPr>
       <w:r>
-        <w:t>Criterios de aceite:</w:t>
+        <w:t>Critérios de aceite:</w:t>
       </w:r>
     </w:p>
     <w:p>
@@ -1547,7 +1547,7 @@
         <w:spacing w:after="30"/>
       </w:pPr>
       <w:r>
-        <w:t>Venda finalizada possui itens, valores, operador, pagamentos e horario.</w:t>
+        <w:t>Venda finalizada possui itens, valores, operador, pagamentos e horário.</w:t>
       </w:r>
     </w:p>
     <w:p>
@@ -1556,7 +1556,7 @@
         <w:spacing w:after="30"/>
       </w:pPr>
       <w:r>
-        <w:t>Estoque e reduzido para os produtos vendidos.</w:t>
+        <w:t>Estoque é reduzido para os produtos vendidos.</w:t>
       </w:r>
     </w:p>
     <w:p>
@@ -1565,7 +1565,7 @@
         <w:spacing w:after="30"/>
       </w:pPr>
       <w:r>
-        <w:t>Venda vinculada a cliente aparece no historico do cliente.</w:t>
+        <w:t>Venda vinculada a cliente aparece no histórico do cliente.</w:t>
       </w:r>
     </w:p>
     <w:p>
@@ -1598,7 +1598,7 @@
         <w:spacing w:after="30"/>
       </w:pPr>
       <w:r>
-        <w:t>PDV identifica indisponibilidade de comunicacao.</w:t>
+        <w:t>PDV identifica indisponibilidade de comunicação.</w:t>
       </w:r>
     </w:p>
     <w:p>
@@ -1607,7 +1607,7 @@
         <w:spacing w:after="30"/>
       </w:pPr>
       <w:r>
-        <w:t>Operador inicia venda usando catalogo local.</w:t>
+        <w:t>Operador inicia venda usando catálogo local.</w:t>
       </w:r>
     </w:p>
     <w:p>
@@ -1616,7 +1616,7 @@
         <w:spacing w:after="30"/>
       </w:pPr>
       <w:r>
-        <w:t>Operador adiciona produtos disponiveis localmente.</w:t>
+        <w:t>Operador adiciona produtos disponíveis localmente.</w:t>
       </w:r>
     </w:p>
     <w:p>
@@ -1643,7 +1643,7 @@
         <w:spacing w:after="30"/>
       </w:pPr>
       <w:r>
-        <w:t>Sistema exibe venda como pendente de sincronizacao.</w:t>
+        <w:t>Sistema exibe venda como pendente de sincronização.</w:t>
       </w:r>
     </w:p>
     <w:p>
@@ -1651,7 +1651,7 @@
         <w:spacing w:after="100"/>
       </w:pPr>
       <w:r>
-        <w:t>Criterios de aceite:</w:t>
+        <w:t>Critérios de aceite:</w:t>
       </w:r>
     </w:p>
     <w:p>
@@ -1660,7 +1660,7 @@
         <w:spacing w:after="30"/>
       </w:pPr>
       <w:r>
-        <w:t>Venda offline nao depende de comunicacao imediata com servidor.</w:t>
+        <w:t>Venda offline não depende de comunicação imediata com servidor.</w:t>
       </w:r>
     </w:p>
     <w:p>
@@ -1669,7 +1669,7 @@
         <w:spacing w:after="30"/>
       </w:pPr>
       <w:r>
-        <w:t>Venda recebe status pendente de sincronizacao.</w:t>
+        <w:t>Venda recebe status pendente de sincronização.</w:t>
       </w:r>
     </w:p>
     <w:p>
@@ -1678,7 +1678,7 @@
         <w:spacing w:after="30"/>
       </w:pPr>
       <w:r>
-        <w:t>Dados minimos da venda ficam preservados localmente.</w:t>
+        <w:t>Dados mínimos da venda ficam preservados localmente.</w:t>
       </w:r>
     </w:p>
     <w:p>
@@ -1711,7 +1711,7 @@
         <w:spacing w:after="30"/>
       </w:pPr>
       <w:r>
-        <w:t>Sistema detecta retorno de comunicacao.</w:t>
+        <w:t>Sistema detecta retorno de comunicação.</w:t>
       </w:r>
     </w:p>
     <w:p>
@@ -1738,7 +1738,7 @@
         <w:spacing w:after="30"/>
       </w:pPr>
       <w:r>
-        <w:t>Servidor baixa estoque quando a venda e aceita.</w:t>
+        <w:t>Servidor baixa estoque quando a venda é aceita.</w:t>
       </w:r>
     </w:p>
     <w:p>
@@ -1756,7 +1756,7 @@
         <w:spacing w:after="30"/>
       </w:pPr>
       <w:r>
-        <w:t>Conflitos sao registrados para revisao.</w:t>
+        <w:t>Conflitos são registrados para revisão.</w:t>
       </w:r>
     </w:p>
     <w:p>
@@ -1764,7 +1764,7 @@
         <w:spacing w:after="100"/>
       </w:pPr>
       <w:r>
-        <w:t>Criterios de aceite:</w:t>
+        <w:t>Critérios de aceite:</w:t>
       </w:r>
     </w:p>
     <w:p>
@@ -1773,7 +1773,7 @@
         <w:spacing w:after="30"/>
       </w:pPr>
       <w:r>
-        <w:t>Venda sincronizada passa a constar nos relatorios.</w:t>
+        <w:t>Venda sincronizada passa a constar nos relatórios.</w:t>
       </w:r>
     </w:p>
     <w:p>
@@ -1791,7 +1791,7 @@
         <w:spacing w:after="30"/>
       </w:pPr>
       <w:r>
-        <w:t>Conflito nao apaga a venda original.</w:t>
+        <w:t>Conflito não apaga a venda original.</w:t>
       </w:r>
     </w:p>
     <w:p>
@@ -1800,7 +1800,7 @@
         <w:spacing w:after="30"/>
       </w:pPr>
       <w:r>
-        <w:t>Falha de sincronizacao mantem venda pendente ou marcada como falha.</w:t>
+        <w:t>Falha de sincronização mantém venda pendente ou marcada como falha.</w:t>
       </w:r>
     </w:p>
     <w:p>
@@ -1808,7 +1808,7 @@
         <w:pStyle w:val="Heading2"/>
       </w:pPr>
       <w:r>
-        <w:t>UC07 - Consultar Cliente e Historico</w:t>
+        <w:t>UC07 - Consultar Cliente e Histórico</w:t>
       </w:r>
     </w:p>
     <w:p>
@@ -1833,7 +1833,7 @@
         <w:spacing w:after="30"/>
       </w:pPr>
       <w:r>
-        <w:t>Usuario pesquisa cliente por nome, telefone ou documento.</w:t>
+        <w:t>Usuário pesquisa cliente por nome, telefone ou documento.</w:t>
       </w:r>
     </w:p>
     <w:p>
@@ -1851,7 +1851,7 @@
         <w:spacing w:after="30"/>
       </w:pPr>
       <w:r>
-        <w:t>Usuario consulta historico de compras.</w:t>
+        <w:t>Usuário consulta histórico de compras.</w:t>
       </w:r>
     </w:p>
     <w:p>
@@ -1868,7 +1868,7 @@
         <w:spacing w:after="100"/>
       </w:pPr>
       <w:r>
-        <w:t>Criterios de aceite:</w:t>
+        <w:t>Critérios de aceite:</w:t>
       </w:r>
     </w:p>
     <w:p>
@@ -1886,7 +1886,7 @@
         <w:spacing w:after="30"/>
       </w:pPr>
       <w:r>
-        <w:t>Historico lista compras vinculadas ao cliente.</w:t>
+        <w:t>Histórico lista compras vinculadas ao cliente.</w:t>
       </w:r>
     </w:p>
     <w:p>
@@ -1895,7 +1895,7 @@
         <w:spacing w:after="30"/>
       </w:pPr>
       <w:r>
-        <w:t>Cliente inativo nao deve ser sugerido para novas vendas.</w:t>
+        <w:t>Cliente inativo não deve ser sugerido para novas vendas.</w:t>
       </w:r>
     </w:p>
     <w:p>
@@ -1903,7 +1903,7 @@
         <w:pStyle w:val="Heading2"/>
       </w:pPr>
       <w:r>
-        <w:t>UC08 - Consultar Relatorios Operacionais</w:t>
+        <w:t>UC08 - Consultar Relatórios Operacionais</w:t>
       </w:r>
     </w:p>
     <w:p>
@@ -1928,7 +1928,7 @@
         <w:spacing w:after="30"/>
       </w:pPr>
       <w:r>
-        <w:t>Usuario acessa area de relatorios.</w:t>
+        <w:t>Usuário acessa área de relatórios.</w:t>
       </w:r>
     </w:p>
     <w:p>
@@ -1937,7 +1937,7 @@
         <w:spacing w:after="30"/>
       </w:pPr>
       <w:r>
-        <w:t>Seleciona tipo de relatorio.</w:t>
+        <w:t>Seleciona tipo de relatório.</w:t>
       </w:r>
     </w:p>
     <w:p>
@@ -1963,7 +1963,7 @@
         <w:spacing w:after="100"/>
       </w:pPr>
       <w:r>
-        <w:t>Criterios de aceite:</w:t>
+        <w:t>Critérios de aceite:</w:t>
       </w:r>
     </w:p>
     <w:p>
@@ -1972,7 +1972,7 @@
         <w:spacing w:after="30"/>
       </w:pPr>
       <w:r>
-        <w:t>Relatorio de vendas filtra por periodo.</w:t>
+        <w:t>Relatório de vendas filtra por período.</w:t>
       </w:r>
     </w:p>
     <w:p>
@@ -1981,7 +1981,7 @@
         <w:spacing w:after="30"/>
       </w:pPr>
       <w:r>
-        <w:t>Relatorio de produtos mais vendidos considera vendas finalizadas e sincronizadas.</w:t>
+        <w:t>Relatório de produtos mais vendidos considera vendas finalizadas e sincronizadas.</w:t>
       </w:r>
     </w:p>
     <w:p>
@@ -1990,7 +1990,7 @@
         <w:spacing w:after="30"/>
       </w:pPr>
       <w:r>
-        <w:t>Relatorio de estoque apresenta saldo atual.</w:t>
+        <w:t>Relatório de estoque apresenta saldo atual.</w:t>
       </w:r>
     </w:p>
     <w:p>
@@ -1999,7 +1999,7 @@
         <w:spacing w:after="30"/>
       </w:pPr>
       <w:r>
-        <w:t>Operador de caixa nao acessa relatorios gerenciais, salvo se autorizado.</w:t>
+        <w:t>Operador de caixa não acessa relatórios gerenciais, salvo se autorizado.</w:t>
       </w:r>
     </w:p>
     <w:p>
@@ -2015,7 +2015,7 @@
         <w:pStyle w:val="Heading2"/>
       </w:pPr>
       <w:r>
-        <w:t>Usuario</w:t>
+        <w:t>Usuário</w:t>
       </w:r>
     </w:p>
     <w:p>
@@ -2094,7 +2094,7 @@
         <w:spacing w:after="30"/>
       </w:pPr>
       <w:r>
-        <w:t>Data de criacao.</w:t>
+        <w:t>Data de criação.</w:t>
       </w:r>
     </w:p>
     <w:p>
@@ -2110,7 +2110,7 @@
         <w:spacing w:after="100"/>
       </w:pPr>
       <w:r>
-        <w:t>Representa conjunto simples de permissoes.</w:t>
+        <w:t>Representa conjunto simples de permissões.</w:t>
       </w:r>
     </w:p>
     <w:p>
@@ -2205,7 +2205,7 @@
         <w:spacing w:after="30"/>
       </w:pPr>
       <w:r>
-        <w:t>Codigo de barras.</w:t>
+        <w:t>Código de barras.</w:t>
       </w:r>
     </w:p>
     <w:p>
@@ -2241,7 +2241,7 @@
         <w:spacing w:after="30"/>
       </w:pPr>
       <w:r>
-        <w:t>Preco de venda.</w:t>
+        <w:t>Preço de venda.</w:t>
       </w:r>
     </w:p>
     <w:p>
@@ -2259,7 +2259,7 @@
         <w:spacing w:after="30"/>
       </w:pPr>
       <w:r>
-        <w:t>Dados fiscais preparatorios.</w:t>
+        <w:t>Dados fiscais preparatórios.</w:t>
       </w:r>
     </w:p>
     <w:p>
@@ -2388,7 +2388,7 @@
         <w:spacing w:after="30"/>
       </w:pPr>
       <w:r>
-        <w:t>Observacoes.</w:t>
+        <w:t>Observações.</w:t>
       </w:r>
     </w:p>
     <w:p>
@@ -2413,7 +2413,7 @@
         <w:spacing w:after="100"/>
       </w:pPr>
       <w:r>
-        <w:t>Pessoa identificada para relacionamento e historico de compras.</w:t>
+        <w:t>Pessoa identificada para relacionamento e histórico de compras.</w:t>
       </w:r>
     </w:p>
     <w:p>
@@ -2526,7 +2526,7 @@
         <w:spacing w:after="30"/>
       </w:pPr>
       <w:r>
-        <w:t>Identificador local temporario, quando offline.</w:t>
+        <w:t>Identificador local temporário, quando offline.</w:t>
       </w:r>
     </w:p>
     <w:p>
@@ -2589,7 +2589,7 @@
         <w:spacing w:after="30"/>
       </w:pPr>
       <w:r>
-        <w:t>Total liquido.</w:t>
+        <w:t>Total líquido.</w:t>
       </w:r>
     </w:p>
     <w:p>
@@ -2607,7 +2607,7 @@
         <w:spacing w:after="30"/>
       </w:pPr>
       <w:r>
-        <w:t>Status de sincronizacao.</w:t>
+        <w:t>Status de sincronização.</w:t>
       </w:r>
     </w:p>
     <w:p>
@@ -2676,7 +2676,7 @@
         <w:spacing w:after="30"/>
       </w:pPr>
       <w:r>
-        <w:t>Preco unitario praticado.</w:t>
+        <w:t>Preço unitário praticado.</w:t>
       </w:r>
     </w:p>
     <w:p>
@@ -2685,7 +2685,7 @@
         <w:spacing w:after="30"/>
       </w:pPr>
       <w:r>
-        <w:t>Desconto do item, quando aplicavel.</w:t>
+        <w:t>Desconto do item, quando aplicável.</w:t>
       </w:r>
     </w:p>
     <w:p>
@@ -2754,7 +2754,7 @@
         <w:spacing w:after="30"/>
       </w:pPr>
       <w:r>
-        <w:t>Observacao, quando aplicavel.</w:t>
+        <w:t>Observação, quando aplicável.</w:t>
       </w:r>
     </w:p>
     <w:p>
@@ -2762,7 +2762,7 @@
         <w:pStyle w:val="Heading2"/>
       </w:pPr>
       <w:r>
-        <w:t>Movimentacao de Estoque</w:t>
+        <w:t>Movimentação de Estoque</w:t>
       </w:r>
     </w:p>
     <w:p>
@@ -2770,7 +2770,7 @@
         <w:spacing w:after="100"/>
       </w:pPr>
       <w:r>
-        <w:t>Registro imutavel de alteracao de saldo de estoque.</w:t>
+        <w:t>Registro imutável de alteração de saldo de estoque.</w:t>
       </w:r>
     </w:p>
     <w:p>
@@ -2796,7 +2796,7 @@
         <w:spacing w:after="30"/>
       </w:pPr>
       <w:r>
-        <w:t>Tipo de movimentacao.</w:t>
+        <w:t>Tipo de movimentação.</w:t>
       </w:r>
     </w:p>
     <w:p>
@@ -2823,7 +2823,7 @@
         <w:spacing w:after="30"/>
       </w:pPr>
       <w:r>
-        <w:t>Usuario responsavel ou processo.</w:t>
+        <w:t>Usuário responsável ou processo.</w:t>
       </w:r>
     </w:p>
     <w:p>
@@ -2867,7 +2867,7 @@
         <w:spacing w:after="30"/>
       </w:pPr>
       <w:r>
-        <w:t>Saida por venda.</w:t>
+        <w:t>Saída por venda.</w:t>
       </w:r>
     </w:p>
     <w:p>
@@ -2892,7 +2892,7 @@
         <w:spacing w:after="100"/>
       </w:pPr>
       <w:r>
-        <w:t>Registro local das vendas feitas sem comunicacao com o servidor.</w:t>
+        <w:t>Registro local das vendas feitas sem comunicação com o servidor.</w:t>
       </w:r>
     </w:p>
     <w:p>
@@ -2927,7 +2927,7 @@
         <w:spacing w:after="30"/>
       </w:pPr>
       <w:r>
-        <w:t>Status de sincronizacao.</w:t>
+        <w:t>Status de sincronização.</w:t>
       </w:r>
     </w:p>
     <w:p>
@@ -2936,7 +2936,7 @@
         <w:spacing w:after="30"/>
       </w:pPr>
       <w:r>
-        <w:t>Numero de tentativas.</w:t>
+        <w:t>Número de tentativas.</w:t>
       </w:r>
     </w:p>
     <w:p>
@@ -2945,7 +2945,7 @@
         <w:spacing w:after="30"/>
       </w:pPr>
       <w:r>
-        <w:t>Ultima tentativa.</w:t>
+        <w:t>Última tentativa.</w:t>
       </w:r>
     </w:p>
     <w:p>
@@ -2962,7 +2962,7 @@
         <w:pStyle w:val="Heading1"/>
       </w:pPr>
       <w:r>
-        <w:t>8. Regras de Negocio</w:t>
+        <w:t>8. Regras de Negócio</w:t>
       </w:r>
     </w:p>
     <w:p>
@@ -2971,7 +2971,7 @@
         <w:spacing w:after="30"/>
       </w:pPr>
       <w:r>
-        <w:t>Produto inativo nao deve aparecer para nova venda.</w:t>
+        <w:t>Produto inativo não deve aparecer para nova venda.</w:t>
       </w:r>
     </w:p>
     <w:p>
@@ -2980,7 +2980,7 @@
         <w:spacing w:after="30"/>
       </w:pPr>
       <w:r>
-        <w:t>Cliente inativo nao deve ser sugerido para nova venda.</w:t>
+        <w:t>Cliente inativo não deve ser sugerido para nova venda.</w:t>
       </w:r>
     </w:p>
     <w:p>
@@ -2989,7 +2989,7 @@
         <w:spacing w:after="30"/>
       </w:pPr>
       <w:r>
-        <w:t>Venda online finalizada deve reduzir estoque imediatamente apos confirmacao.</w:t>
+        <w:t>Venda online finalizada deve reduzir estoque imediatamente após confirmação.</w:t>
       </w:r>
     </w:p>
     <w:p>
@@ -2998,7 +2998,7 @@
         <w:spacing w:after="30"/>
       </w:pPr>
       <w:r>
-        <w:t>Venda offline deve reduzir estoque somente apos sincronizacao aceita pelo servidor.</w:t>
+        <w:t>Venda offline deve reduzir estoque somente após sincronização aceita pelo servidor.</w:t>
       </w:r>
     </w:p>
     <w:p>
@@ -3007,7 +3007,7 @@
         <w:spacing w:after="30"/>
       </w:pPr>
       <w:r>
-        <w:t>Venda offline deve receber identificador local temporario.</w:t>
+        <w:t>Venda offline deve receber identificador local temporário.</w:t>
       </w:r>
     </w:p>
     <w:p>
@@ -3016,7 +3016,7 @@
         <w:spacing w:after="30"/>
       </w:pPr>
       <w:r>
-        <w:t>Venda offline deve manter status de sincronizacao visivel.</w:t>
+        <w:t>Venda offline deve manter status de sincronização visível.</w:t>
       </w:r>
     </w:p>
     <w:p>
@@ -3025,7 +3025,7 @@
         <w:spacing w:after="30"/>
       </w:pPr>
       <w:r>
-        <w:t>Conflitos de preco, produto ou estoque devem ser registrados para revisao.</w:t>
+        <w:t>Conflitos de preço, produto ou estoque devem ser registrados para revisão.</w:t>
       </w:r>
     </w:p>
     <w:p>
@@ -3034,7 +3034,7 @@
         <w:spacing w:after="30"/>
       </w:pPr>
       <w:r>
-        <w:t>Conflito de sincronizacao nao deve apagar a venda offline original.</w:t>
+        <w:t>Conflito de sincronização não deve apagar a venda offline original.</w:t>
       </w:r>
     </w:p>
     <w:p>
@@ -3043,7 +3043,7 @@
         <w:spacing w:after="30"/>
       </w:pPr>
       <w:r>
-        <w:t>Historico do cliente deve ser derivado de vendas vinculadas.</w:t>
+        <w:t>Histórico do cliente deve ser derivado de vendas vinculadas.</w:t>
       </w:r>
     </w:p>
     <w:p>
@@ -3061,7 +3061,7 @@
         <w:spacing w:after="30"/>
       </w:pPr>
       <w:r>
-        <w:t>Operacoes criticas devem registrar usuario responsavel e data/hora.</w:t>
+        <w:t>Operações críticas devem registrar usuário responsável e data/hora.</w:t>
       </w:r>
     </w:p>
     <w:p>
@@ -3070,7 +3070,7 @@
         <w:spacing w:after="30"/>
       </w:pPr>
       <w:r>
-        <w:t>O sistema nao deve emitir documento fiscal no MVP.</w:t>
+        <w:t>O sistema não deve emitir documento fiscal no MVP.</w:t>
       </w:r>
     </w:p>
     <w:p>
@@ -3078,7 +3078,7 @@
         <w:pStyle w:val="Heading1"/>
       </w:pPr>
       <w:r>
-        <w:t>9. Requisitos Nao Funcionais</w:t>
+        <w:t>9. Requisitos Não Funcionais</w:t>
       </w:r>
     </w:p>
     <w:p>
@@ -3122,7 +3122,7 @@
         <w:spacing w:after="30"/>
       </w:pPr>
       <w:r>
-        <w:t>Interface web responsiva para areas administrativas.</w:t>
+        <w:t>Interface web responsiva para áreas administrativas.</w:t>
       </w:r>
     </w:p>
     <w:p>
@@ -3139,7 +3139,7 @@
         <w:pStyle w:val="Heading2"/>
       </w:pPr>
       <w:r>
-        <w:t>9.2 Seguranca</w:t>
+        <w:t>9.2 Segurança</w:t>
       </w:r>
     </w:p>
     <w:p>
@@ -3148,7 +3148,7 @@
         <w:spacing w:after="30"/>
       </w:pPr>
       <w:r>
-        <w:t>Autenticacao obrigatoria.</w:t>
+        <w:t>Autenticação obrigatória.</w:t>
       </w:r>
     </w:p>
     <w:p>
@@ -3166,7 +3166,7 @@
         <w:spacing w:after="30"/>
       </w:pPr>
       <w:r>
-        <w:t>Autorizacao por perfil.</w:t>
+        <w:t>Autorização por perfil.</w:t>
       </w:r>
     </w:p>
     <w:p>
@@ -3175,7 +3175,7 @@
         <w:spacing w:after="30"/>
       </w:pPr>
       <w:r>
-        <w:t>Bloqueio de usuarios inativos.</w:t>
+        <w:t>Bloqueio de usuários inativos.</w:t>
       </w:r>
     </w:p>
     <w:p>
@@ -3184,7 +3184,7 @@
         <w:spacing w:after="30"/>
       </w:pPr>
       <w:r>
-        <w:t>Validacao de entradas no frontend e backend.</w:t>
+        <w:t>Validação de entradas no frontend e backend.</w:t>
       </w:r>
     </w:p>
     <w:p>
@@ -3193,7 +3193,7 @@
         <w:spacing w:after="30"/>
       </w:pPr>
       <w:r>
-        <w:t>Auditoria basica de operacoes criticas.</w:t>
+        <w:t>Auditoria básica de operações críticas.</w:t>
       </w:r>
     </w:p>
     <w:p>
@@ -3219,7 +3219,7 @@
         <w:spacing w:after="30"/>
       </w:pPr>
       <w:r>
-        <w:t>O PDV deve manter catalogo local previamente carregado.</w:t>
+        <w:t>O PDV deve manter catálogo local previamente carregado.</w:t>
       </w:r>
     </w:p>
     <w:p>
@@ -3228,7 +3228,7 @@
         <w:spacing w:after="30"/>
       </w:pPr>
       <w:r>
-        <w:t>Vendas offline devem ser preservadas ate sincronizacao bem-sucedida ou revisao de falha.</w:t>
+        <w:t>Vendas offline devem ser preservadas até sincronização bem-sucedida ou revisão de falha.</w:t>
       </w:r>
     </w:p>
     <w:p>
@@ -3263,7 +3263,7 @@
         <w:spacing w:after="30"/>
       </w:pPr>
       <w:r>
-        <w:t>Busca por produto deve aceitar codigo e nome.</w:t>
+        <w:t>Busca por produto deve aceitar código e nome.</w:t>
       </w:r>
     </w:p>
     <w:p>
@@ -3272,7 +3272,7 @@
         <w:spacing w:after="30"/>
       </w:pPr>
       <w:r>
-        <w:t>Mensagens de erro devem ser claras para usuarios operacionais.</w:t>
+        <w:t>Mensagens de erro devem ser claras para usuários operacionais.</w:t>
       </w:r>
     </w:p>
     <w:p>
@@ -3281,7 +3281,7 @@
         <w:spacing w:after="30"/>
       </w:pPr>
       <w:r>
-        <w:t>Telas de cadastro devem destacar campos obrigatorios.</w:t>
+        <w:t>Telas de cadastro devem destacar campos obrigatórios.</w:t>
       </w:r>
     </w:p>
     <w:p>
@@ -3297,7 +3297,7 @@
         <w:spacing w:after="100"/>
       </w:pPr>
       <w:r>
-        <w:t>Devem ser auditadas, no minimo:</w:t>
+        <w:t>Devem ser auditadas, no mínimo:</w:t>
       </w:r>
     </w:p>
     <w:p>
@@ -3306,7 +3306,7 @@
         <w:spacing w:after="30"/>
       </w:pPr>
       <w:r>
-        <w:t>Criacao e alteracao de produto.</w:t>
+        <w:t>Criação e alteração de produto.</w:t>
       </w:r>
     </w:p>
     <w:p>
@@ -3333,7 +3333,7 @@
         <w:spacing w:after="30"/>
       </w:pPr>
       <w:r>
-        <w:t>Finalizacao de venda.</w:t>
+        <w:t>Finalização de venda.</w:t>
       </w:r>
     </w:p>
     <w:p>
@@ -3342,7 +3342,7 @@
         <w:spacing w:after="30"/>
       </w:pPr>
       <w:r>
-        <w:t>Sincronizacao de venda offline.</w:t>
+        <w:t>Sincronização de venda offline.</w:t>
       </w:r>
     </w:p>
     <w:p>
@@ -3351,7 +3351,7 @@
         <w:spacing w:after="30"/>
       </w:pPr>
       <w:r>
-        <w:t>Alteracao de usuario ou perfil.</w:t>
+        <w:t>Alteração de usuário ou perfil.</w:t>
       </w:r>
     </w:p>
     <w:p>
@@ -3368,7 +3368,7 @@
         <w:spacing w:after="30"/>
       </w:pPr>
       <w:r>
-        <w:t>Emissao de NFC-e ou NF-e.</w:t>
+        <w:t>Emissão de NFC-e ou NF-e.</w:t>
       </w:r>
     </w:p>
     <w:p>
@@ -3377,7 +3377,7 @@
         <w:spacing w:after="30"/>
       </w:pPr>
       <w:r>
-        <w:t>Integracao fiscal com SEFAZ.</w:t>
+        <w:t>Integração fiscal com SEFAZ.</w:t>
       </w:r>
     </w:p>
     <w:p>
@@ -3404,7 +3404,7 @@
         <w:spacing w:after="30"/>
       </w:pPr>
       <w:r>
-        <w:t>Conciliacao financeira.</w:t>
+        <w:t>Conciliação financeira.</w:t>
       </w:r>
     </w:p>
     <w:p>
@@ -3449,7 +3449,7 @@
         <w:spacing w:after="30"/>
       </w:pPr>
       <w:r>
-        <w:t>Multi-deposito.</w:t>
+        <w:t>Multi-depósito.</w:t>
       </w:r>
     </w:p>
     <w:p>
@@ -3520,7 +3520,7 @@
         <w:pStyle w:val="Heading1"/>
       </w:pPr>
       <w:r>
-        <w:t>11. Criterios Gerais de Aceite</w:t>
+        <w:t>11. Critérios Gerais de Aceite</w:t>
       </w:r>
     </w:p>
     <w:p>
@@ -3529,7 +3529,7 @@
         <w:spacing w:after="30"/>
       </w:pPr>
       <w:r>
-        <w:t>Deve ser possivel cadastrar um produto ativo e vende-lo no PDV.</w:t>
+        <w:t>Deve ser possível cadastrar um produto ativo e vendê-lo no PDV.</w:t>
       </w:r>
     </w:p>
     <w:p>
@@ -3538,7 +3538,7 @@
         <w:spacing w:after="30"/>
       </w:pPr>
       <w:r>
-        <w:t>Deve ser possivel registrar entrada de estoque e visualizar saldo atualizado.</w:t>
+        <w:t>Deve ser possível registrar entrada de estoque e visualizar saldo atualizado.</w:t>
       </w:r>
     </w:p>
     <w:p>
@@ -3547,7 +3547,7 @@
         <w:spacing w:after="30"/>
       </w:pPr>
       <w:r>
-        <w:t>Venda online finalizada deve aparecer em relatorio de vendas.</w:t>
+        <w:t>Venda online finalizada deve aparecer em relatório de vendas.</w:t>
       </w:r>
     </w:p>
     <w:p>
@@ -3574,7 +3574,7 @@
         <w:spacing w:after="30"/>
       </w:pPr>
       <w:r>
-        <w:t>Venda offline deve sincronizar quando a comunicacao voltar.</w:t>
+        <w:t>Venda offline deve sincronizar quando a comunicação voltar.</w:t>
       </w:r>
     </w:p>
     <w:p>
@@ -3583,7 +3583,7 @@
         <w:spacing w:after="30"/>
       </w:pPr>
       <w:r>
-        <w:t>Venda offline sincronizada deve aparecer em relatorios e baixar estoque.</w:t>
+        <w:t>Venda offline sincronizada deve aparecer em relatórios e baixar estoque.</w:t>
       </w:r>
     </w:p>
     <w:p>
@@ -3592,7 +3592,7 @@
         <w:spacing w:after="30"/>
       </w:pPr>
       <w:r>
-        <w:t>Venda vinculada a cliente deve aparecer no historico do cliente.</w:t>
+        <w:t>Venda vinculada a cliente deve aparecer no histórico do cliente.</w:t>
       </w:r>
     </w:p>
     <w:p>
@@ -3601,7 +3601,7 @@
         <w:spacing w:after="30"/>
       </w:pPr>
       <w:r>
-        <w:t>Perfis devem restringir acesso a funcionalidades sensiveis.</w:t>
+        <w:t>Perfis devem restringir acesso a funcionalidades sensíveis.</w:t>
       </w:r>
     </w:p>
     <w:p>
@@ -3610,7 +3610,7 @@
         <w:spacing w:after="30"/>
       </w:pPr>
       <w:r>
-        <w:t>Dados fiscais devem existir apenas como preparacao cadastral, sem emissao fiscal.</w:t>
+        <w:t>Dados fiscais devem existir apenas como preparação cadastral, sem emissão fiscal.</w:t>
       </w:r>
     </w:p>
     <w:p>
@@ -3618,7 +3618,7 @@
         <w:pStyle w:val="Heading1"/>
       </w:pPr>
       <w:r>
-        <w:t>12. Sugestao de Priorizacao para Backlog</w:t>
+        <w:t>12. Sugestão de Priorização para Backlog</w:t>
       </w:r>
     </w:p>
     <w:p>
@@ -3635,7 +3635,7 @@
         <w:spacing w:after="30"/>
       </w:pPr>
       <w:r>
-        <w:t>Autenticacao e perfis.</w:t>
+        <w:t>Autenticação e perfis.</w:t>
       </w:r>
     </w:p>
     <w:p>
@@ -3662,7 +3662,7 @@
         <w:spacing w:after="30"/>
       </w:pPr>
       <w:r>
-        <w:t>Cadastro de usuarios.</w:t>
+        <w:t>Cadastro de usuários.</w:t>
       </w:r>
     </w:p>
     <w:p>
@@ -3715,7 +3715,7 @@
         <w:spacing w:after="30"/>
       </w:pPr>
       <w:r>
-        <w:t>Relatorio de vendas por periodo.</w:t>
+        <w:t>Relatório de vendas por período.</w:t>
       </w:r>
     </w:p>
     <w:p>
@@ -3723,7 +3723,7 @@
         <w:pStyle w:val="Heading2"/>
       </w:pPr>
       <w:r>
-        <w:t>Prioridade 3 - Entradas e CRM Basico</w:t>
+        <w:t>Prioridade 3 - Entradas e CRM Básico</w:t>
       </w:r>
     </w:p>
     <w:p>
@@ -3759,7 +3759,7 @@
         <w:spacing w:after="30"/>
       </w:pPr>
       <w:r>
-        <w:t>Vinculo de cliente na venda.</w:t>
+        <w:t>Vínculo de cliente na venda.</w:t>
       </w:r>
     </w:p>
     <w:p>
@@ -3768,7 +3768,7 @@
         <w:spacing w:after="30"/>
       </w:pPr>
       <w:r>
-        <w:t>Historico de compras.</w:t>
+        <w:t>Histórico de compras.</w:t>
       </w:r>
     </w:p>
     <w:p>
@@ -3785,7 +3785,7 @@
         <w:spacing w:after="30"/>
       </w:pPr>
       <w:r>
-        <w:t>Catalogo local do PDV.</w:t>
+        <w:t>Catálogo local do PDV.</w:t>
       </w:r>
     </w:p>
     <w:p>
@@ -3803,7 +3803,7 @@
         <w:spacing w:after="30"/>
       </w:pPr>
       <w:r>
-        <w:t>Sincronizacao de vendas.</w:t>
+        <w:t>Sincronização de vendas.</w:t>
       </w:r>
     </w:p>
     <w:p>
@@ -3820,7 +3820,7 @@
         <w:pStyle w:val="Heading2"/>
       </w:pPr>
       <w:r>
-        <w:t>Prioridade 5 - Relatorios Complementares</w:t>
+        <w:t>Prioridade 5 - Relatórios Complementares</w:t>
       </w:r>
     </w:p>
     <w:p>
@@ -3847,7 +3847,7 @@
         <w:spacing w:after="30"/>
       </w:pPr>
       <w:r>
-        <w:t>Movimentacoes de estoque.</w:t>
+        <w:t>Movimentações de estoque.</w:t>
       </w:r>
     </w:p>
     <w:p>
@@ -3864,7 +3864,7 @@
         <w:pStyle w:val="Heading1"/>
       </w:pPr>
       <w:r>
-        <w:t>13. Riscos e Decisoes Futuras</w:t>
+        <w:t>13. Riscos e Decisões Futuras</w:t>
       </w:r>
     </w:p>
     <w:p>
@@ -3873,7 +3873,7 @@
         <w:spacing w:after="30"/>
       </w:pPr>
       <w:r>
-        <w:t>Offline parcial aumenta a complexidade do PDV e deve ser validado cedo com prototipo tecnico.</w:t>
+        <w:t>Offline parcial aumenta a complexidade do PDV e deve ser validado cedo com protótipo técnico.</w:t>
       </w:r>
     </w:p>
     <w:p>
@@ -3882,7 +3882,7 @@
         <w:spacing w:after="30"/>
       </w:pPr>
       <w:r>
-        <w:t>Fiscal sem emissao reduz escopo, mas os campos preparatorios devem ser definidos com cuidado para nao bloquear NFC-e/NF-e futuramente.</w:t>
+        <w:t>Fiscal sem emissão reduz escopo, mas os campos preparatórios devem ser definidos com cuidado para não bloquear NFC-e/NF-e futuramente.</w:t>
       </w:r>
     </w:p>
     <w:p>
@@ -3891,7 +3891,7 @@
         <w:spacing w:after="30"/>
       </w:pPr>
       <w:r>
-        <w:t>Controle de estoque sem lote e validade atende o MVP, mas pode ser insuficiente para mercados com pereciveis.</w:t>
+        <w:t>Controle de estoque sem lote e validade atende o MVP, mas pode ser insuficiente para mercados com perecíveis.</w:t>
       </w:r>
     </w:p>
     <w:p>
@@ -3900,7 +3900,7 @@
         <w:spacing w:after="30"/>
       </w:pPr>
       <w:r>
-        <w:t>Pagamento manual acelera o MVP, mas TEF e PIX integrado devem ser avaliados antes de operacao em escala.</w:t>
+        <w:t>Pagamento manual acelera o MVP, mas TEF e PIX integrado devem ser avaliados antes de operação em escala.</w:t>
       </w:r>
     </w:p>
     <w:p>
@@ -3909,7 +3909,7 @@
         <w:spacing w:after="30"/>
       </w:pPr>
       <w:r>
-        <w:t>Multi-loja esta fora do MVP; a modelagem inicial deve evitar acoplamento desnecessario a uma unica loja caso expansao seja provavel.</w:t>
+        <w:t>Multi-loja está fora do MVP; a modelagem inicial deve evitar acoplamento desnecessário a uma única loja caso expansão seja provável.</w:t>
       </w:r>
     </w:p>
     <w:p>
@@ -3917,7 +3917,7 @@
         <w:pStyle w:val="Heading1"/>
       </w:pPr>
       <w:r>
-        <w:t>14. Assumptions</w:t>
+        <w:t>14. Premissas</w:t>
       </w:r>
     </w:p>
     <w:p>
@@ -3926,7 +3926,7 @@
         <w:spacing w:after="30"/>
       </w:pPr>
       <w:r>
-        <w:t>O MVP atende pequenos mercados com uma loja por implantacao.</w:t>
+        <w:t>O MVP atende pequenos mercados com uma loja por implantação.</w:t>
       </w:r>
     </w:p>
     <w:p>
@@ -3935,7 +3935,7 @@
         <w:spacing w:after="30"/>
       </w:pPr>
       <w:r>
-        <w:t>O foco inicial e operacao de loja, nao financeiro completo.</w:t>
+        <w:t>O foco inicial é operação de loja, não financeiro completo.</w:t>
       </w:r>
     </w:p>
     <w:p>
@@ -3944,7 +3944,7 @@
         <w:spacing w:after="30"/>
       </w:pPr>
       <w:r>
-        <w:t>O PDV offline parcial usa catalogo e precos previamente carregados.</w:t>
+        <w:t>O PDV offline parcial usa catálogo e preços previamente carregados.</w:t>
       </w:r>
     </w:p>
     <w:p>
@@ -3953,7 +3953,7 @@
         <w:spacing w:after="30"/>
       </w:pPr>
       <w:r>
-        <w:t>Vendas offline sao preservadas localmente ate sincronizacao.</w:t>
+        <w:t>Vendas offline são preservadas localmente até sincronização.</w:t>
       </w:r>
     </w:p>
     <w:p>
@@ -3962,7 +3962,7 @@
         <w:spacing w:after="30"/>
       </w:pPr>
       <w:r>
-        <w:t>O sistema registra pagamentos manualmente, sem confirmar transacoes externas.</w:t>
+        <w:t>O sistema registra pagamentos manualmente, sem confirmar transações externas.</w:t>
       </w:r>
     </w:p>
     <w:p>
@@ -3971,7 +3971,7 @@
         <w:spacing w:after="30"/>
       </w:pPr>
       <w:r>
-        <w:t>Dados fiscais sao apenas preparatorios no MVP.</w:t>
+        <w:t>Dados fiscais são apenas preparatórios no MVP.</w:t>
       </w:r>
     </w:p>
     <w:p>
@@ -3980,7 +3980,7 @@
         <w:spacing w:after="30"/>
       </w:pPr>
       <w:r>
-        <w:t>O documento sera usado como base para backlog, modelagem de dados e arquitetura inicial.</w:t>
+        <w:t>O documento será usado como base para backlog, modelagem de dados e arquitetura inicial.</w:t>
       </w:r>
     </w:p>
     <w:sectPr>

</xml_diff>